<commit_message>
feat: 源码与配置更新 (W03/W04 pedagogical updates and task progress)
</commit_message>
<xml_diff>
--- a/信息可视化/Output/实验材料/信息可视化设计_实验认定表_实验3_交互可视化开发.docx
+++ b/信息可视化/Output/实验材料/信息可视化设计_实验认定表_实验3_交互可视化开发.docx
@@ -568,23 +568,7 @@
                 <w:spacing w:val="-8"/>
                 <w:sz w:val="22"/>
               </w:rPr>
-              <w:t>（</w:t>
-            </w:r>
-            <w:r>
-              <w:rPr>
-                <w:rFonts w:ascii="SimSun" w:eastAsia="SimSun" w:hAnsi="SimSun" w:cs="Times New Roman" w:hint="eastAsia"/>
-                <w:sz w:val="24"/>
-                <w:szCs w:val="24"/>
-              </w:rPr>
-              <w:t>教材</w:t>
-            </w:r>
-            <w:r>
-              <w:rPr>
-                <w:rFonts w:ascii="SimSun" w:eastAsia="SimSun" w:hAnsi="SimSun" w:cs="Times New Roman" w:hint="eastAsia"/>
-                <w:spacing w:val="-8"/>
-                <w:sz w:val="22"/>
-              </w:rPr>
-              <w:t>）</w:t>
+              <w:t xml:space="preserve">（教材）</w:t>
             </w:r>
           </w:p>
         </w:tc>

</xml_diff>